<commit_message>
Publish website from 2e18a89
</commit_message>
<xml_diff>
--- a/main-docx/manuscript.docx
+++ b/main-docx/manuscript.docx
@@ -2611,7 +2611,7 @@
             <w:r>
               <w:drawing>
                 <wp:inline>
-                  <wp:extent cx="5943600" cy="2786062"/>
+                  <wp:extent cx="5943600" cy="4692315"/>
                   <wp:effectExtent b="0" l="0" r="0" t="0"/>
                   <wp:docPr descr="" title="" id="38" name="Picture"/>
                   <a:graphic>
@@ -2632,7 +2632,7 @@
                         <pic:spPr bwMode="auto">
                           <a:xfrm>
                             <a:off x="0" y="0"/>
-                            <a:ext cx="5943600" cy="2786062"/>
+                            <a:ext cx="5943600" cy="4692315"/>
                           </a:xfrm>
                           <a:prstGeom prst="rect">
                             <a:avLst/>

</xml_diff>

<commit_message>
Publish website from 157c007
</commit_message>
<xml_diff>
--- a/main-docx/manuscript.docx
+++ b/main-docx/manuscript.docx
@@ -2348,7 +2348,7 @@
         <w:pStyle w:val="BodyText"/>
       </w:pPr>
       <w:r>
-        <w:t xml:space="preserve">As the volume of academic articles and media coverage differs substantially, we compare relative prevalence of technology clusters, expressed as the attention share of each cluster. Academic and media discourse allocated attention systematically differently across technology clusters (</w:t>
+        <w:t xml:space="preserve">As the volume of academic articles and media coverage differs substantially, we compared technology clusters using two complementary attention-share bases (</w:t>
       </w:r>
       <w:hyperlink w:anchor="fig-academic-media-comparison">
         <w:r>
@@ -2359,7 +2359,56 @@
         </w:r>
       </w:hyperlink>
       <w:r>
-        <w:t xml:space="preserve">). Descriptively, several patterns emerge: Technologies that account for a large share of academic attention are generally also discussed extensively in the media.</w:t>
+        <w:t xml:space="preserve">): an absolute basis, in which each cluster’s mentions are expressed as a share of</w:t>
+      </w:r>
+      <w:r>
+        <w:t xml:space="preserve"> </w:t>
+      </w:r>
+      <w:r>
+        <w:rPr>
+          <w:i/>
+          <w:iCs/>
+        </w:rPr>
+        <w:t xml:space="preserve">all</w:t>
+      </w:r>
+      <w:r>
+        <w:t xml:space="preserve"> </w:t>
+      </w:r>
+      <w:r>
+        <w:t xml:space="preserve">publications or news articles published that year, and a relative basis, in which mentions are expressed as a share of technology-related mentions only. On the absolute basis, academic articles devoted a comparatively larger share of attention to essentially every technology cluster than media coverage did, and by a wide margin for</w:t>
+      </w:r>
+      <w:r>
+        <w:t xml:space="preserve"> </w:t>
+      </w:r>
+      <w:r>
+        <w:rPr>
+          <w:i/>
+          <w:iCs/>
+        </w:rPr>
+        <w:t xml:space="preserve">Generative AI</w:t>
+      </w:r>
+      <w:r>
+        <w:t xml:space="preserve"> </w:t>
+      </w:r>
+      <w:r>
+        <w:t xml:space="preserve">(see</w:t>
+      </w:r>
+      <w:r>
+        <w:t xml:space="preserve"> </w:t>
+      </w:r>
+      <w:hyperlink w:anchor="fig-academic-media-comparison">
+        <w:r>
+          <w:rPr>
+            <w:rStyle w:val="Hyperlink"/>
+          </w:rPr>
+          <w:t xml:space="preserve">Figure 3</w:t>
+        </w:r>
+      </w:hyperlink>
+      <w:r>
+        <w:t xml:space="preserve"> </w:t>
+      </w:r>
+      <w:r>
+        <w:t xml:space="preserve">Panel A). Within technology-related discourse however, the two corpora diverge in how they distribute the share of technology-related attention. Descriptively, several patterns emerge: Technologies that account for a large share of academic attention are generally also discussed extensively in the media.</w:t>
       </w:r>
       <w:r>
         <w:t xml:space="preserve"> </w:t>
@@ -2506,7 +2555,7 @@
         <w:pStyle w:val="BodyText"/>
       </w:pPr>
       <w:r>
-        <w:t xml:space="preserve">To examine whether these differences reflect temporal differences in academic and media discourse, we correlated their annual attention shares across lags from −5 to +5 years. Positive lags indicate that media attention preceded academic attention, whereas negative lags indicate that academic attention came first (for details on the method and results for individual technologies, see</w:t>
+        <w:t xml:space="preserve">To examine whether these differences reflect temporal differences in academic and media discourse, we correlated their annual attention shares across lags from −5 to +5 years on both bases (for details on the method and results for individual technologies on both bases, see</w:t>
       </w:r>
       <w:r>
         <w:t xml:space="preserve"> </w:t>
@@ -2523,7 +2572,46 @@
         <w:t xml:space="preserve">supplementary materials E</w:t>
       </w:r>
       <w:r>
-        <w:t xml:space="preserve">). For most clusters, the strongest correspondence occurred at a positive lag—usually between 3 and 5 years—suggesting that academic attention generally followed media attention.</w:t>
+        <w:t xml:space="preserve">). Both on an absolute basis as well as on a relative basis, the strongest correspondence for most clusters occurred at a positive lag—usually between 3 and 5 years—suggesting that academic attention generally followed media attention. By contrast, academic attention preceded media attention for</w:t>
+      </w:r>
+      <w:r>
+        <w:t xml:space="preserve"> </w:t>
+      </w:r>
+      <w:r>
+        <w:rPr>
+          <w:i/>
+          <w:iCs/>
+        </w:rPr>
+        <w:t xml:space="preserve">Tracking &amp; Wearables</w:t>
+      </w:r>
+      <w:r>
+        <w:t xml:space="preserve">,</w:t>
+      </w:r>
+      <w:r>
+        <w:t xml:space="preserve"> </w:t>
+      </w:r>
+      <w:r>
+        <w:rPr>
+          <w:i/>
+          <w:iCs/>
+        </w:rPr>
+        <w:t xml:space="preserve">E-Commerce</w:t>
+      </w:r>
+      <w:r>
+        <w:t xml:space="preserve">, and</w:t>
+      </w:r>
+      <w:r>
+        <w:t xml:space="preserve"> </w:t>
+      </w:r>
+      <w:r>
+        <w:rPr>
+          <w:i/>
+          <w:iCs/>
+        </w:rPr>
+        <w:t xml:space="preserve">Mobility &amp; Transportation</w:t>
+      </w:r>
+      <w:r>
+        <w:t xml:space="preserve">.</w:t>
       </w:r>
       <w:r>
         <w:t xml:space="preserve"> </w:t>
@@ -2539,46 +2627,7 @@
         <w:t xml:space="preserve"> </w:t>
       </w:r>
       <w:r>
-        <w:t xml:space="preserve">was a notable exception because academic and media attention increased within a similar period. By contrast, academic attention preceded media attention for</w:t>
-      </w:r>
-      <w:r>
-        <w:t xml:space="preserve"> </w:t>
-      </w:r>
-      <w:r>
-        <w:rPr>
-          <w:i/>
-          <w:iCs/>
-        </w:rPr>
-        <w:t xml:space="preserve">Tracking &amp; Wearables</w:t>
-      </w:r>
-      <w:r>
-        <w:t xml:space="preserve">,</w:t>
-      </w:r>
-      <w:r>
-        <w:t xml:space="preserve"> </w:t>
-      </w:r>
-      <w:r>
-        <w:rPr>
-          <w:i/>
-          <w:iCs/>
-        </w:rPr>
-        <w:t xml:space="preserve">E-Commerce</w:t>
-      </w:r>
-      <w:r>
-        <w:t xml:space="preserve">, and</w:t>
-      </w:r>
-      <w:r>
-        <w:t xml:space="preserve"> </w:t>
-      </w:r>
-      <w:r>
-        <w:rPr>
-          <w:i/>
-          <w:iCs/>
-        </w:rPr>
-        <w:t xml:space="preserve">Mobility &amp; Transportation</w:t>
-      </w:r>
-      <w:r>
-        <w:t xml:space="preserve">.</w:t>
+        <w:t xml:space="preserve">was the only cluster which showed a similar and essentially concurrent attention trajectory over time.</w:t>
       </w:r>
     </w:p>
     <w:p>
@@ -2586,7 +2635,7 @@
         <w:pStyle w:val="BodyText"/>
       </w:pPr>
       <w:r>
-        <w:t xml:space="preserve">Comparing media coverage with academic articles in the fashion we do must be treated cautiously however: First, our pipeline only includes technologies discussed in academic articles since 2000, meaning that technologies that are simply not discussed in academic discourse are missed. Second, although the data volume is substantive, lag analyses on 11 total lags are to be interpreted cautiously, as they are vulnerable to outliers and autocorrelation.</w:t>
+        <w:t xml:space="preserve">Comparing media coverage with academic articles in the fashion we do must be treated cautiously however: First, our pipeline only matches media coverage against technologies discussed in academic articles since 2000, meaning that technologies that are simply not discussed in academic discourse are missed. Second, although the data volume is substantive, lag analyses on 11 total lags are to be interpreted cautiously, as they are vulnerable to outliers and autocorrelation.</w:t>
       </w:r>
     </w:p>
     <w:tbl>
@@ -2611,14 +2660,14 @@
             <w:r>
               <w:drawing>
                 <wp:inline>
-                  <wp:extent cx="5943600" cy="4692315"/>
+                  <wp:extent cx="5943600" cy="2331433"/>
                   <wp:effectExtent b="0" l="0" r="0" t="0"/>
                   <wp:docPr descr="" title="" id="38" name="Picture"/>
                   <a:graphic>
                     <a:graphicData uri="http://schemas.openxmlformats.org/drawingml/2006/picture">
                       <pic:pic>
                         <pic:nvPicPr>
-                          <pic:cNvPr descr="./figures/compare/coverage_scatter.png" id="39" name="Picture"/>
+                          <pic:cNvPr descr="./figures/compare/combined/coverage_scatter.png" id="39" name="Picture"/>
                           <pic:cNvPicPr>
                             <a:picLocks noChangeArrowheads="1" noChangeAspect="1"/>
                           </pic:cNvPicPr>
@@ -2632,7 +2681,7 @@
                         <pic:spPr bwMode="auto">
                           <a:xfrm>
                             <a:off x="0" y="0"/>
-                            <a:ext cx="5943600" cy="4692315"/>
+                            <a:ext cx="5943600" cy="2331433"/>
                           </a:xfrm>
                           <a:prstGeom prst="rect">
                             <a:avLst/>
@@ -2661,7 +2710,7 @@
               <w:pStyle w:val="ImageCaption"/>
             </w:pPr>
             <w:r>
-              <w:t xml:space="preserve">Figure 3: Mean annual academic and media attention shares across technology clusters, 2008–2026. The diagonal indicates equal attention shares. Points above the line receive a comparatively larger academic share; points below the line receive a comparatively larger media share. Media attention serves as an external indicator of visibility rather than a normative benchmark for research priorities.</w:t>
+              <w:t xml:space="preserve">Figure 3: Mean annual academic and media attention shares across technology clusters, 2008–2026. Panel A shows the relative basis (share of technology-related mentions only); Panel B shows the absolute basis (share of all publications/articles that year). The diagonal indicates equal attention shares. Points above the line receive a comparatively larger academic share; points below the line receive a comparatively larger media share. Media attention serves as an external indicator of visibility rather than a normative benchmark for research priorities.</w:t>
             </w:r>
           </w:p>
           <w:bookmarkEnd w:id="40"/>

</xml_diff>

<commit_message>
Publish website from 48bd091
</commit_message>
<xml_diff>
--- a/main-docx/manuscript.docx
+++ b/main-docx/manuscript.docx
@@ -200,7 +200,7 @@
         <w:pStyle w:val="FirstParagraph"/>
       </w:pPr>
       <w:r>
-        <w:t xml:space="preserve">[Abstract placeholder]</w:t>
+        <w:t xml:space="preserve">Consumer-facing technologies increasingly shape everyday life, yet research on them remains fragmented across labels, domains, and time. We map the evolution of empirical consumer-technology research published between 2000 and June 2026 in seven leading marketing and consumer-behavior journals. Using a two-stage large-language-model based screening procedure, we identified 1,102 articles examining consumer-facing technologies. We standardized the extracted technology terms, represented them as semantic embeddings, and grouped 901 canonical technologies into 16 clusters using UMAP and k-means clustering. We then examined changes in cluster prevalence over time and compared academic attention with U.S. news coverage of consumer-facing technologies under academic study. Consumer-technology research expanded sharply after 2013, while its focus shows clear patterns of emphasizing specific technologies, most recently generative AI. Academic attention was uneven across clusters, with marketer-relevant and emerging technologies receiving disproportionate emphasis compared to U.S. news coverage. These patterns suggest that the field often follows technological novelty and public visibility, while mature or diffuse technologies may become less visible as research objects. Our map reduces fragmentation and supports more cumulative research across related technologies. We call for stronger emphasis on defragmenting the research landscape of consumer-technology, renewed attention to normalized technologies, and closer scrutiny of whether visible technologies warrant dominance or merely reflect short-lived novelty.</w:t>
       </w:r>
     </w:p>
     <w:bookmarkEnd w:id="22"/>
@@ -218,10 +218,6 @@
         <w:pStyle w:val="FirstParagraph"/>
       </w:pPr>
       <w:r>
-        <w:rPr>
-          <w:b/>
-          <w:bCs/>
-        </w:rPr>
         <w:t xml:space="preserve">Background</w:t>
       </w:r>
     </w:p>
@@ -263,13 +259,21 @@
     </w:p>
     <w:p>
       <w:pPr>
+        <w:pStyle w:val="Compact"/>
+        <w:numPr>
+          <w:ilvl w:val="0"/>
+          <w:numId w:val="1001"/>
+        </w:numPr>
+      </w:pPr>
+      <w:r>
+        <w:t xml:space="preserve">lead over to that this also naturally increases the research interest to understand how consumers and technologies interact</w:t>
+      </w:r>
+    </w:p>
+    <w:p>
+      <w:pPr>
         <w:pStyle w:val="FirstParagraph"/>
       </w:pPr>
       <w:r>
-        <w:rPr>
-          <w:b/>
-          <w:bCs/>
-        </w:rPr>
         <w:t xml:space="preserve">Problem</w:t>
       </w:r>
     </w:p>
@@ -294,7 +298,7 @@
         </w:numPr>
       </w:pPr>
       <w:r>
-        <w:t xml:space="preserve">What has the domain of consumer-technology-research been over the past 26 years?</w:t>
+        <w:t xml:space="preserve">What has the domain of consumer-technology-research been up to over the past 26 years?</w:t>
       </w:r>
     </w:p>
     <w:p>
@@ -330,7 +334,7 @@
         </w:numPr>
       </w:pPr>
       <w:r>
-        <w:t xml:space="preserve">Aim of this review article: By conducting a bibliometric and semantic corpus-analysis of seven leading journals in the marketing and consumer-behavior domain, this review article aims to provide an overview over the evolving landscape of empirical consumer-technology-research over the last 25 years.</w:t>
+        <w:t xml:space="preserve">Aim of this review article: By conducting a bibliometric and semantic corpus-analysis of seven leading journals in the marketing and consumer-behavior domain, this review article aims to provide an overview over the evolving landscape of empirical consumer-technology-research over the last 26 years.</w:t>
       </w:r>
     </w:p>
     <w:p>
@@ -338,10 +342,6 @@
         <w:pStyle w:val="FirstParagraph"/>
       </w:pPr>
       <w:r>
-        <w:rPr>
-          <w:b/>
-          <w:bCs/>
-        </w:rPr>
         <w:t xml:space="preserve">Contribution</w:t>
       </w:r>
     </w:p>
@@ -354,73 +354,7 @@
         </w:numPr>
       </w:pPr>
       <w:r>
-        <w:t xml:space="preserve">The problem with fragmentation: Hard to provide a comprehensive overview if you don’t know what is out there. Our first contribution is therefore a systematic overview that comes bottom-up, meaning that we hope to not miss anything we studied</w:t>
-      </w:r>
-    </w:p>
-    <w:p>
-      <w:pPr>
-        <w:pStyle w:val="Compact"/>
-        <w:numPr>
-          <w:ilvl w:val="1"/>
-          <w:numId w:val="1005"/>
-        </w:numPr>
-      </w:pPr>
-      <w:r>
-        <w:t xml:space="preserve">jingle-jangle fallacy</w:t>
-      </w:r>
-    </w:p>
-    <w:p>
-      <w:pPr>
-        <w:pStyle w:val="Compact"/>
-        <w:numPr>
-          <w:ilvl w:val="1"/>
-          <w:numId w:val="1005"/>
-        </w:numPr>
-      </w:pPr>
-      <w:r>
-        <w:t xml:space="preserve">Without consolidating related labels, a field-level review may misrepresent both the size and the boundaries of research areas.</w:t>
-      </w:r>
-    </w:p>
-    <w:p>
-      <w:pPr>
-        <w:pStyle w:val="Compact"/>
-        <w:numPr>
-          <w:ilvl w:val="1"/>
-          <w:numId w:val="1005"/>
-        </w:numPr>
-      </w:pPr>
-      <w:r>
-        <w:t xml:space="preserve">we cannot say what areas have been studied how if we cannot even say what the areas are to begin with</w:t>
-      </w:r>
-    </w:p>
-    <w:p>
-      <w:pPr>
-        <w:pStyle w:val="Compact"/>
-        <w:numPr>
-          <w:ilvl w:val="1"/>
-          <w:numId w:val="1005"/>
-        </w:numPr>
-      </w:pPr>
-      <w:r>
-        <w:t xml:space="preserve">also tie into the superficial traps of comparing</w:t>
-      </w:r>
-      <w:r>
-        <w:t xml:space="preserve"> </w:t>
-      </w:r>
-      <w:r>
-        <w:t xml:space="preserve">“Chatgpt 4”</w:t>
-      </w:r>
-      <w:r>
-        <w:t xml:space="preserve"> </w:t>
-      </w:r>
-      <w:r>
-        <w:t xml:space="preserve">with</w:t>
-      </w:r>
-      <w:r>
-        <w:t xml:space="preserve"> </w:t>
-      </w:r>
-      <w:r>
-        <w:t xml:space="preserve">“4.1”</w:t>
+        <w:t xml:space="preserve">Use novel methods to defragment a landscape</w:t>
       </w:r>
     </w:p>
     <w:p>
@@ -432,19 +366,7 @@
         </w:numPr>
       </w:pPr>
       <w:r>
-        <w:t xml:space="preserve">The problem with attention: It doesn’t only matter what we study, it also matters when, and how much. This is important because academic research is shaped by many factors</w:t>
-      </w:r>
-    </w:p>
-    <w:p>
-      <w:pPr>
-        <w:pStyle w:val="Compact"/>
-        <w:numPr>
-          <w:ilvl w:val="1"/>
-          <w:numId w:val="1006"/>
-        </w:numPr>
-      </w:pPr>
-      <w:r>
-        <w:t xml:space="preserve">reference tech-traps paper?</w:t>
+        <w:t xml:space="preserve">Disentangle academic interest temporally and overall over 26 years of research</w:t>
       </w:r>
     </w:p>
     <w:p>
@@ -456,19 +378,7 @@
         </w:numPr>
       </w:pPr>
       <w:r>
-        <w:t xml:space="preserve">The problem with disconnect from the public discourse: Is the devotion to certain topics given by academics appropriate when looking at what</w:t>
-      </w:r>
-      <w:r>
-        <w:t xml:space="preserve"> </w:t>
-      </w:r>
-      <w:r>
-        <w:t xml:space="preserve">“real consumers out there”</w:t>
-      </w:r>
-      <w:r>
-        <w:t xml:space="preserve"> </w:t>
-      </w:r>
-      <w:r>
-        <w:t xml:space="preserve">are interested in? Our third contribution is that we compare academic discourse with the attention the media gives these themes</w:t>
+        <w:t xml:space="preserve">Compare academic focus against media discourse to identify if what we study is what matters to consumers</w:t>
       </w:r>
     </w:p>
     <w:p>
@@ -498,10 +408,6 @@
         <w:pStyle w:val="FirstParagraph"/>
       </w:pPr>
       <w:r>
-        <w:rPr>
-          <w:b/>
-          <w:bCs/>
-        </w:rPr>
         <w:t xml:space="preserve">What do we mean, when we say, we study consumer-technologies</w:t>
       </w:r>
     </w:p>
@@ -510,7 +416,7 @@
         <w:pStyle w:val="Compact"/>
         <w:numPr>
           <w:ilvl w:val="0"/>
-          <w:numId w:val="1007"/>
+          <w:numId w:val="1005"/>
         </w:numPr>
       </w:pPr>
       <w:r>
@@ -531,27 +437,28 @@
         <w:pStyle w:val="Compact"/>
         <w:numPr>
           <w:ilvl w:val="0"/>
-          <w:numId w:val="1007"/>
+          <w:numId w:val="1005"/>
         </w:numPr>
       </w:pPr>
       <w:r>
-        <w:t xml:space="preserve">Define</w:t>
-      </w:r>
-      <w:r>
-        <w:t xml:space="preserve"> </w:t>
-      </w:r>
-      <w:r>
-        <w:rPr>
-          <w:b/>
-          <w:bCs/>
-        </w:rPr>
-        <w:t xml:space="preserve">consumer-facing technologies</w:t>
-      </w:r>
-      <w:r>
-        <w:t xml:space="preserve"> </w:t>
-      </w:r>
-      <w:r>
-        <w:t xml:space="preserve">as technologies that consumers directly use, encounter, or experience.</w:t>
+        <w:t xml:space="preserve">Define consumer-facing technologies as technologies that consumers directly use, encounter, or experience.</w:t>
+      </w:r>
+    </w:p>
+    <w:p>
+      <w:pPr>
+        <w:pStyle w:val="FirstParagraph"/>
+      </w:pPr>
+      <w:r>
+        <w:t xml:space="preserve">Why can’t we just google-scholar</w:t>
+      </w:r>
+      <w:r>
+        <w:t xml:space="preserve"> </w:t>
+      </w:r>
+      <w:r>
+        <w:t xml:space="preserve">“consumer-tech”</w:t>
+      </w:r>
+      <w:r>
+        <w:t xml:space="preserve">?</w:t>
       </w:r>
     </w:p>
     <w:p>
@@ -559,23 +466,77 @@
         <w:pStyle w:val="Compact"/>
         <w:numPr>
           <w:ilvl w:val="0"/>
+          <w:numId w:val="1006"/>
+        </w:numPr>
+      </w:pPr>
+      <w:r>
+        <w:t xml:space="preserve">The problem with fragmentation: Hard to provide a comprehensive overview if you don’t know what is out there.</w:t>
+      </w:r>
+    </w:p>
+    <w:p>
+      <w:pPr>
+        <w:pStyle w:val="Compact"/>
+        <w:numPr>
+          <w:ilvl w:val="1"/>
           <w:numId w:val="1007"/>
         </w:numPr>
       </w:pPr>
       <w:r>
-        <w:t xml:space="preserve">Empirical articles, because The objective is to map where empirical research attention has accumulated, Empirical articles provide a comparable basis for assessing the coverage of different technologies., Conceptual, normative, legal, and design-oriented work remain important but address a different review question.</w:t>
-      </w:r>
-    </w:p>
-    <w:p>
-      <w:pPr>
-        <w:pStyle w:val="FirstParagraph"/>
-      </w:pPr>
-      <w:r>
-        <w:rPr>
-          <w:b/>
-          <w:bCs/>
-        </w:rPr>
-        <w:t xml:space="preserve">Methodological Background</w:t>
+        <w:t xml:space="preserve">jingle-jangle fallacy</w:t>
+      </w:r>
+    </w:p>
+    <w:p>
+      <w:pPr>
+        <w:pStyle w:val="Compact"/>
+        <w:numPr>
+          <w:ilvl w:val="1"/>
+          <w:numId w:val="1007"/>
+        </w:numPr>
+      </w:pPr>
+      <w:r>
+        <w:t xml:space="preserve">Without consolidating related labels, a field-level review may misrepresent both the size and the boundaries of research areas.</w:t>
+      </w:r>
+    </w:p>
+    <w:p>
+      <w:pPr>
+        <w:pStyle w:val="Compact"/>
+        <w:numPr>
+          <w:ilvl w:val="1"/>
+          <w:numId w:val="1007"/>
+        </w:numPr>
+      </w:pPr>
+      <w:r>
+        <w:t xml:space="preserve">we cannot say what areas have been studied how if we cannot even say what the areas are to begin with</w:t>
+      </w:r>
+    </w:p>
+    <w:p>
+      <w:pPr>
+        <w:pStyle w:val="Compact"/>
+        <w:numPr>
+          <w:ilvl w:val="1"/>
+          <w:numId w:val="1007"/>
+        </w:numPr>
+      </w:pPr>
+      <w:r>
+        <w:t xml:space="preserve">also tie into the superficial traps of comparing</w:t>
+      </w:r>
+      <w:r>
+        <w:t xml:space="preserve"> </w:t>
+      </w:r>
+      <w:r>
+        <w:t xml:space="preserve">“Chatgpt 4”</w:t>
+      </w:r>
+      <w:r>
+        <w:t xml:space="preserve"> </w:t>
+      </w:r>
+      <w:r>
+        <w:t xml:space="preserve">with</w:t>
+      </w:r>
+      <w:r>
+        <w:t xml:space="preserve"> </w:t>
+      </w:r>
+      <w:r>
+        <w:t xml:space="preserve">“4.1”</w:t>
       </w:r>
     </w:p>
     <w:p>
@@ -583,11 +544,23 @@
         <w:pStyle w:val="Compact"/>
         <w:numPr>
           <w:ilvl w:val="0"/>
+          <w:numId w:val="1006"/>
+        </w:numPr>
+      </w:pPr>
+      <w:r>
+        <w:t xml:space="preserve">The problem with attention: It doesn’t only matter what we study, it also matters when, and how much. This is important because academic research is shaped by many factors</w:t>
+      </w:r>
+    </w:p>
+    <w:p>
+      <w:pPr>
+        <w:pStyle w:val="Compact"/>
+        <w:numPr>
+          <w:ilvl w:val="1"/>
           <w:numId w:val="1008"/>
         </w:numPr>
       </w:pPr>
       <w:r>
-        <w:t xml:space="preserve">Jingle jangle fallacy as an example of what we do</w:t>
+        <w:t xml:space="preserve">reference tech-traps paper?</w:t>
       </w:r>
     </w:p>
     <w:p>
@@ -595,17 +568,31 @@
         <w:pStyle w:val="Compact"/>
         <w:numPr>
           <w:ilvl w:val="0"/>
-          <w:numId w:val="1008"/>
+          <w:numId w:val="1006"/>
         </w:numPr>
       </w:pPr>
       <w:r>
-        <w:t xml:space="preserve">bibliometric analysis as a way to map a field</w:t>
-      </w:r>
-      <w:r>
-        <w:t xml:space="preserve"> </w:t>
-      </w:r>
-      <w:r>
-        <w:t xml:space="preserve">[2,3, and others]</w:t>
+        <w:t xml:space="preserve">The problem with disconnect from the public discourse: Is the devotion to certain topics given by academics appropriate when looking at what</w:t>
+      </w:r>
+      <w:r>
+        <w:t xml:space="preserve"> </w:t>
+      </w:r>
+      <w:r>
+        <w:t xml:space="preserve">“real consumers out there”</w:t>
+      </w:r>
+      <w:r>
+        <w:t xml:space="preserve"> </w:t>
+      </w:r>
+      <w:r>
+        <w:t xml:space="preserve">are interested in?</w:t>
+      </w:r>
+    </w:p>
+    <w:p>
+      <w:pPr>
+        <w:pStyle w:val="FirstParagraph"/>
+      </w:pPr>
+      <w:r>
+        <w:t xml:space="preserve">Methodological Background</w:t>
       </w:r>
     </w:p>
     <w:p>
@@ -613,7 +600,37 @@
         <w:pStyle w:val="Compact"/>
         <w:numPr>
           <w:ilvl w:val="0"/>
-          <w:numId w:val="1008"/>
+          <w:numId w:val="1009"/>
+        </w:numPr>
+      </w:pPr>
+      <w:r>
+        <w:t xml:space="preserve">Jingle jangle fallacy as an example of what we do</w:t>
+      </w:r>
+    </w:p>
+    <w:p>
+      <w:pPr>
+        <w:pStyle w:val="Compact"/>
+        <w:numPr>
+          <w:ilvl w:val="0"/>
+          <w:numId w:val="1009"/>
+        </w:numPr>
+      </w:pPr>
+      <w:r>
+        <w:t xml:space="preserve">bibliometric analysis as a way to map a field</w:t>
+      </w:r>
+      <w:r>
+        <w:t xml:space="preserve"> </w:t>
+      </w:r>
+      <w:r>
+        <w:t xml:space="preserve">[2,3, and others]</w:t>
+      </w:r>
+    </w:p>
+    <w:p>
+      <w:pPr>
+        <w:pStyle w:val="Compact"/>
+        <w:numPr>
+          <w:ilvl w:val="0"/>
+          <w:numId w:val="1009"/>
         </w:numPr>
       </w:pPr>
       <w:r>
@@ -2733,7 +2750,7 @@
         <w:pStyle w:val="Compact"/>
         <w:numPr>
           <w:ilvl w:val="0"/>
-          <w:numId w:val="1009"/>
+          <w:numId w:val="1010"/>
         </w:numPr>
       </w:pPr>
       <w:r>
@@ -2745,7 +2762,7 @@
         <w:pStyle w:val="Compact"/>
         <w:numPr>
           <w:ilvl w:val="0"/>
-          <w:numId w:val="1009"/>
+          <w:numId w:val="1010"/>
         </w:numPr>
       </w:pPr>
       <w:r>
@@ -2757,7 +2774,7 @@
         <w:pStyle w:val="Compact"/>
         <w:numPr>
           <w:ilvl w:val="0"/>
-          <w:numId w:val="1009"/>
+          <w:numId w:val="1010"/>
         </w:numPr>
       </w:pPr>
       <w:r>
@@ -2769,7 +2786,7 @@
         <w:pStyle w:val="Compact"/>
         <w:numPr>
           <w:ilvl w:val="0"/>
-          <w:numId w:val="1009"/>
+          <w:numId w:val="1010"/>
         </w:numPr>
       </w:pPr>
       <w:r>
@@ -2781,7 +2798,7 @@
         <w:pStyle w:val="Compact"/>
         <w:numPr>
           <w:ilvl w:val="1"/>
-          <w:numId w:val="1010"/>
+          <w:numId w:val="1011"/>
         </w:numPr>
       </w:pPr>
       <w:r>
@@ -2793,7 +2810,7 @@
         <w:pStyle w:val="Compact"/>
         <w:numPr>
           <w:ilvl w:val="2"/>
-          <w:numId w:val="1011"/>
+          <w:numId w:val="1012"/>
         </w:numPr>
       </w:pPr>
       <w:r>
@@ -2804,8 +2821,8 @@
       <w:pPr>
         <w:pStyle w:val="Compact"/>
         <w:numPr>
-          <w:ilvl w:val="3"/>
-          <w:numId w:val="1012"/>
+          <w:ilvl w:val="0"/>
+          <w:numId w:val="1010"/>
         </w:numPr>
       </w:pPr>
       <w:r>
@@ -2816,8 +2833,8 @@
       <w:pPr>
         <w:pStyle w:val="Compact"/>
         <w:numPr>
-          <w:ilvl w:val="3"/>
-          <w:numId w:val="1012"/>
+          <w:ilvl w:val="0"/>
+          <w:numId w:val="1010"/>
         </w:numPr>
       </w:pPr>
       <w:r>
@@ -2828,8 +2845,8 @@
       <w:pPr>
         <w:pStyle w:val="Compact"/>
         <w:numPr>
-          <w:ilvl w:val="3"/>
-          <w:numId w:val="1012"/>
+          <w:ilvl w:val="0"/>
+          <w:numId w:val="1010"/>
         </w:numPr>
       </w:pPr>
       <w:r>
@@ -2841,7 +2858,7 @@
         <w:pStyle w:val="Compact"/>
         <w:numPr>
           <w:ilvl w:val="1"/>
-          <w:numId w:val="1010"/>
+          <w:numId w:val="1013"/>
         </w:numPr>
       </w:pPr>
       <w:r>
@@ -2853,7 +2870,7 @@
         <w:pStyle w:val="Compact"/>
         <w:numPr>
           <w:ilvl w:val="2"/>
-          <w:numId w:val="1013"/>
+          <w:numId w:val="1014"/>
         </w:numPr>
       </w:pPr>
       <w:r>
@@ -2865,47 +2882,7 @@
         <w:pStyle w:val="FirstParagraph"/>
       </w:pPr>
       <w:r>
-        <w:rPr>
-          <w:b/>
-          <w:bCs/>
-        </w:rPr>
-        <w:t xml:space="preserve">Recommendations</w:t>
-      </w:r>
-      <w:r>
-        <w:t xml:space="preserve"> </w:t>
-      </w:r>
-      <w:r>
-        <w:t xml:space="preserve">- Improve consistency in naming and describing consumer-facing technologies.</w:t>
-      </w:r>
-      <w:r>
-        <w:t xml:space="preserve"> </w:t>
-      </w:r>
-      <w:r>
-        <w:t xml:space="preserve">- Report both specific technology labels and broader technology families.</w:t>
-      </w:r>
-      <w:r>
-        <w:t xml:space="preserve"> </w:t>
-      </w:r>
-      <w:r>
-        <w:t xml:space="preserve">- Build cumulative research across related technologies rather than treating every new label as an isolated domain.</w:t>
-      </w:r>
-      <w:r>
-        <w:t xml:space="preserve"> </w:t>
-      </w:r>
-      <w:r>
-        <w:t xml:space="preserve">- Revisit mature technologies whose effects may be obscured by normalization.</w:t>
-      </w:r>
-      <w:r>
-        <w:t xml:space="preserve"> </w:t>
-      </w:r>
-      <w:r>
-        <w:t xml:space="preserve">- Examine themes that remain weakly covered despite substantial consumer reach or public visibility.</w:t>
-      </w:r>
-      <w:r>
-        <w:t xml:space="preserve"> </w:t>
-      </w:r>
-      <w:r>
-        <w:t xml:space="preserve">- Track whether attention to highly visible technologies persists beyond their initial surge.</w:t>
+        <w:t xml:space="preserve">Limitations</w:t>
       </w:r>
     </w:p>
     <w:p>
@@ -2913,99 +2890,11 @@
         <w:pStyle w:val="Compact"/>
         <w:numPr>
           <w:ilvl w:val="0"/>
-          <w:numId w:val="1014"/>
-        </w:numPr>
-      </w:pPr>
-      <w:r>
-        <w:rPr>
-          <w:b/>
-          <w:bCs/>
-        </w:rPr>
-        <w:t xml:space="preserve">Limitations</w:t>
-      </w:r>
-    </w:p>
-    <w:p>
-      <w:pPr>
-        <w:pStyle w:val="Compact"/>
-        <w:numPr>
-          <w:ilvl w:val="1"/>
           <w:numId w:val="1015"/>
         </w:numPr>
       </w:pPr>
       <w:r>
         <w:t xml:space="preserve">The academic corpus is restricted to seven consumer-research journals and does not represent all psychological or interdisciplinary technology research.</w:t>
-      </w:r>
-    </w:p>
-    <w:p>
-      <w:pPr>
-        <w:pStyle w:val="Compact"/>
-        <w:numPr>
-          <w:ilvl w:val="1"/>
-          <w:numId w:val="1015"/>
-        </w:numPr>
-      </w:pPr>
-      <w:r>
-        <w:t xml:space="preserve">The focus on empirical articles excludes conceptual, normative, legal, and design-oriented contributions.</w:t>
-      </w:r>
-    </w:p>
-    <w:p>
-      <w:pPr>
-        <w:pStyle w:val="Compact"/>
-        <w:numPr>
-          <w:ilvl w:val="1"/>
-          <w:numId w:val="1015"/>
-        </w:numPr>
-      </w:pPr>
-      <w:r>
-        <w:t xml:space="preserve">The semantic themes depend on the labels extracted from titles and abstracts.</w:t>
-      </w:r>
-    </w:p>
-    <w:p>
-      <w:pPr>
-        <w:pStyle w:val="Compact"/>
-        <w:numPr>
-          <w:ilvl w:val="1"/>
-          <w:numId w:val="1015"/>
-        </w:numPr>
-      </w:pPr>
-      <w:r>
-        <w:t xml:space="preserve">Technologies may be discussed without being explicitly named, particularly after becoming embedded or normalized -&gt; we cannot exclude that this might also be part of why we have a decline</w:t>
-      </w:r>
-    </w:p>
-    <w:p>
-      <w:pPr>
-        <w:pStyle w:val="Compact"/>
-        <w:numPr>
-          <w:ilvl w:val="1"/>
-          <w:numId w:val="1015"/>
-        </w:numPr>
-      </w:pPr>
-      <w:r>
-        <w:t xml:space="preserve">Media Cloud coverage varies across sources and years, particularly before 2008.</w:t>
-      </w:r>
-    </w:p>
-    <w:p>
-      <w:pPr>
-        <w:pStyle w:val="Compact"/>
-        <w:numPr>
-          <w:ilvl w:val="1"/>
-          <w:numId w:val="1015"/>
-        </w:numPr>
-      </w:pPr>
-      <w:r>
-        <w:t xml:space="preserve">Media coverage indicates visibility rather than adoption or societal importance.</w:t>
-      </w:r>
-    </w:p>
-    <w:p>
-      <w:pPr>
-        <w:pStyle w:val="Compact"/>
-        <w:numPr>
-          <w:ilvl w:val="1"/>
-          <w:numId w:val="1015"/>
-        </w:numPr>
-      </w:pPr>
-      <w:r>
-        <w:t xml:space="preserve">Temporal and media comparisons are exploratory</w:t>
       </w:r>
     </w:p>
     <w:p>
@@ -3013,15 +2902,159 @@
         <w:pStyle w:val="Compact"/>
         <w:numPr>
           <w:ilvl w:val="0"/>
-          <w:numId w:val="1014"/>
+          <w:numId w:val="1015"/>
         </w:numPr>
       </w:pPr>
       <w:r>
-        <w:rPr>
-          <w:b/>
-          <w:bCs/>
-        </w:rPr>
-        <w:t xml:space="preserve">Conclusion</w:t>
+        <w:t xml:space="preserve">The focus on empirical articles excludes conceptual, normative, legal, and design-oriented contributions.</w:t>
+      </w:r>
+    </w:p>
+    <w:p>
+      <w:pPr>
+        <w:pStyle w:val="Compact"/>
+        <w:numPr>
+          <w:ilvl w:val="0"/>
+          <w:numId w:val="1015"/>
+        </w:numPr>
+      </w:pPr>
+      <w:r>
+        <w:t xml:space="preserve">The semantic themes depend on the labels extracted from titles and abstracts.</w:t>
+      </w:r>
+    </w:p>
+    <w:p>
+      <w:pPr>
+        <w:pStyle w:val="Compact"/>
+        <w:numPr>
+          <w:ilvl w:val="0"/>
+          <w:numId w:val="1015"/>
+        </w:numPr>
+      </w:pPr>
+      <w:r>
+        <w:t xml:space="preserve">Technologies may be discussed without being explicitly named, particularly after becoming embedded or normalized -&gt; we cannot exclude that this might also be part of why we have a decline</w:t>
+      </w:r>
+    </w:p>
+    <w:p>
+      <w:pPr>
+        <w:pStyle w:val="Compact"/>
+        <w:numPr>
+          <w:ilvl w:val="0"/>
+          <w:numId w:val="1015"/>
+        </w:numPr>
+      </w:pPr>
+      <w:r>
+        <w:t xml:space="preserve">Media Cloud coverage varies across sources and years, particularly before 2008.</w:t>
+      </w:r>
+    </w:p>
+    <w:p>
+      <w:pPr>
+        <w:pStyle w:val="Compact"/>
+        <w:numPr>
+          <w:ilvl w:val="0"/>
+          <w:numId w:val="1015"/>
+        </w:numPr>
+      </w:pPr>
+      <w:r>
+        <w:t xml:space="preserve">Media coverage indicates visibility rather than adoption or societal importance.</w:t>
+      </w:r>
+    </w:p>
+    <w:p>
+      <w:pPr>
+        <w:pStyle w:val="Compact"/>
+        <w:numPr>
+          <w:ilvl w:val="0"/>
+          <w:numId w:val="1015"/>
+        </w:numPr>
+      </w:pPr>
+      <w:r>
+        <w:t xml:space="preserve">Temporal and media comparisons are exploratory</w:t>
+      </w:r>
+    </w:p>
+    <w:p>
+      <w:pPr>
+        <w:pStyle w:val="FirstParagraph"/>
+      </w:pPr>
+      <w:r>
+        <w:t xml:space="preserve">Recommendations</w:t>
+      </w:r>
+    </w:p>
+    <w:p>
+      <w:pPr>
+        <w:pStyle w:val="Compact"/>
+        <w:numPr>
+          <w:ilvl w:val="0"/>
+          <w:numId w:val="1016"/>
+        </w:numPr>
+      </w:pPr>
+      <w:r>
+        <w:t xml:space="preserve">Improve consistency in naming and describing consumer-facing technologies.</w:t>
+      </w:r>
+    </w:p>
+    <w:p>
+      <w:pPr>
+        <w:pStyle w:val="Compact"/>
+        <w:numPr>
+          <w:ilvl w:val="0"/>
+          <w:numId w:val="1016"/>
+        </w:numPr>
+      </w:pPr>
+      <w:r>
+        <w:t xml:space="preserve">Report both specific technology labels and broader technology families, and make sure the research doesn’t focus overly narrow on one specific flavor of technology.</w:t>
+      </w:r>
+    </w:p>
+    <w:p>
+      <w:pPr>
+        <w:pStyle w:val="Compact"/>
+        <w:numPr>
+          <w:ilvl w:val="0"/>
+          <w:numId w:val="1016"/>
+        </w:numPr>
+      </w:pPr>
+      <w:r>
+        <w:t xml:space="preserve">Build cumulative research across related technologies rather than treating every new label as an isolated domain.</w:t>
+      </w:r>
+    </w:p>
+    <w:p>
+      <w:pPr>
+        <w:pStyle w:val="Compact"/>
+        <w:numPr>
+          <w:ilvl w:val="0"/>
+          <w:numId w:val="1016"/>
+        </w:numPr>
+      </w:pPr>
+      <w:r>
+        <w:t xml:space="preserve">Revisit mature technologies whose effects may be obscured by normalization.</w:t>
+      </w:r>
+    </w:p>
+    <w:p>
+      <w:pPr>
+        <w:pStyle w:val="Compact"/>
+        <w:numPr>
+          <w:ilvl w:val="0"/>
+          <w:numId w:val="1016"/>
+        </w:numPr>
+      </w:pPr>
+      <w:r>
+        <w:t xml:space="preserve">Examine themes that remain weakly covered despite substantial consumer reach or public visibility.</w:t>
+      </w:r>
+    </w:p>
+    <w:p>
+      <w:pPr>
+        <w:pStyle w:val="Compact"/>
+        <w:numPr>
+          <w:ilvl w:val="0"/>
+          <w:numId w:val="1016"/>
+        </w:numPr>
+      </w:pPr>
+      <w:r>
+        <w:t xml:space="preserve">Track whether attention to highly visible technologies persists beyond their initial surge.</w:t>
+      </w:r>
+    </w:p>
+    <w:p>
+      <w:pPr>
+        <w:pStyle w:val="FirstParagraph"/>
+      </w:pPr>
+      <w:r>
+        <w:t xml:space="preserve">conclusion</w:t>
       </w:r>
     </w:p>
     <w:p>
@@ -9253,6 +9286,9 @@
     <w:abstractNumId w:val="991"/>
   </w:num>
   <w:num w:numId="1015">
+    <w:abstractNumId w:val="991"/>
+  </w:num>
+  <w:num w:numId="1016">
     <w:abstractNumId w:val="991"/>
   </w:num>
 </w:numbering>

</xml_diff>